<commit_message>
Pitch template: presentation date is 10/13 (Tue)
The Word file as updated, and its PDF re-exported from it.

Co-Authored-By: Claude Opus 5.5 <noreply@anthropic.com>
</commit_message>
<xml_diff>
--- a/final-project/OL7014_project_template.docx
+++ b/final-project/OL7014_project_template.docx
@@ -80,7 +80,47 @@
           <w:szCs w:val="18"/>
           <w:lang w:eastAsia="ko-KR"/>
         </w:rPr>
-        <w:t>발표: 10월 10일(토) 수업 시간</w:t>
+        <w:t>발표: 10월 1</w:t>
+      </w:r>
+      <w:r>
+        <w:rPr>
+          <w:rFonts w:ascii="맑은 고딕" w:hAnsi="맑은 고딕" w:cs="맑은 고딕"/>
+          <w:b/>
+          <w:sz w:val="18"/>
+          <w:szCs w:val="18"/>
+          <w:lang w:eastAsia="ko-KR"/>
+        </w:rPr>
+        <w:t>3</w:t>
+      </w:r>
+      <w:r>
+        <w:rPr>
+          <w:rFonts w:ascii="맑은 고딕" w:hAnsi="맑은 고딕" w:cs="맑은 고딕"/>
+          <w:b/>
+          <w:sz w:val="18"/>
+          <w:szCs w:val="18"/>
+          <w:lang w:eastAsia="ko-KR"/>
+        </w:rPr>
+        <w:t>일(</w:t>
+      </w:r>
+      <w:r>
+        <w:rPr>
+          <w:rFonts w:ascii="맑은 고딕" w:hAnsi="맑은 고딕" w:cs="맑은 고딕" w:hint="eastAsia"/>
+          <w:b/>
+          <w:sz w:val="18"/>
+          <w:szCs w:val="18"/>
+          <w:lang w:eastAsia="ko-KR"/>
+        </w:rPr>
+        <w:t>화</w:t>
+      </w:r>
+      <w:r>
+        <w:rPr>
+          <w:rFonts w:ascii="맑은 고딕" w:hAnsi="맑은 고딕" w:cs="맑은 고딕"/>
+          <w:b/>
+          <w:sz w:val="18"/>
+          <w:szCs w:val="18"/>
+          <w:lang w:eastAsia="ko-KR"/>
+        </w:rPr>
+        <w:t>) 수업 시간</w:t>
       </w:r>
     </w:p>
     <w:tbl>
@@ -156,9 +196,6 @@
           <w:p>
             <w:pPr>
               <w:spacing w:after="0" w:line="240" w:lineRule="auto"/>
-              <w:rPr>
-                <w:rFonts w:hint="eastAsia"/>
-              </w:rPr>
             </w:pPr>
             <w:r>
               <w:rPr>
@@ -891,6 +928,9 @@
       <w:pPr>
         <w:keepNext/>
         <w:spacing w:after="60" w:line="240" w:lineRule="auto"/>
+        <w:rPr>
+          <w:lang w:eastAsia="ko-KR"/>
+        </w:rPr>
       </w:pPr>
       <w:r>
         <w:rPr>
@@ -931,11 +971,17 @@
           <w:p>
             <w:pPr>
               <w:spacing w:after="0" w:line="240" w:lineRule="auto"/>
+              <w:rPr>
+                <w:lang w:eastAsia="ko-KR"/>
+              </w:rPr>
             </w:pPr>
           </w:p>
           <w:p>
             <w:pPr>
               <w:spacing w:after="0" w:line="240" w:lineRule="auto"/>
+              <w:rPr>
+                <w:lang w:eastAsia="ko-KR"/>
+              </w:rPr>
             </w:pPr>
           </w:p>
         </w:tc>
@@ -988,12 +1034,54 @@
           <w:szCs w:val="18"/>
           <w:lang w:eastAsia="ko-KR"/>
         </w:rPr>
-        <w:t>비슷한 문제를 다룬 논문·보고서를 찾아보세요. 검색: Google Scholar, RISS, DBpia, DTIC(미 국방 기술보고서), 한국국방경영분석학회지. 키워드 예: (문제 이름) + stochastic programming / two-stage / robust optimization / chance constraint / distributionally robust. 그들은 불확실성을 어떻게 다뤘고, 우리 아이디어는 무엇이 다른가요?</w:t>
+        <w:t xml:space="preserve">비슷한 문제를 다룬 논문·보고서를 찾아보세요. 검색: Google Scholar, RISS, </w:t>
+      </w:r>
+      <w:proofErr w:type="spellStart"/>
+      <w:r>
+        <w:rPr>
+          <w:rFonts w:ascii="맑은 고딕" w:hAnsi="맑은 고딕" w:cs="맑은 고딕"/>
+          <w:color w:val="6E6E6E"/>
+          <w:sz w:val="18"/>
+          <w:szCs w:val="18"/>
+          <w:lang w:eastAsia="ko-KR"/>
+        </w:rPr>
+        <w:t>DBpia</w:t>
+      </w:r>
+      <w:proofErr w:type="spellEnd"/>
+      <w:r>
+        <w:rPr>
+          <w:rFonts w:ascii="맑은 고딕" w:hAnsi="맑은 고딕" w:cs="맑은 고딕"/>
+          <w:color w:val="6E6E6E"/>
+          <w:sz w:val="18"/>
+          <w:szCs w:val="18"/>
+          <w:lang w:eastAsia="ko-KR"/>
+        </w:rPr>
+        <w:t>, DTIC(미 국방 기술보고서), 한국국방경영분석학회지. 키워드 예: (문제 이름) +</w:t>
+      </w:r>
+      <w:r>
+        <w:rPr>
+          <w:rFonts w:ascii="맑은 고딕" w:hAnsi="맑은 고딕" w:cs="맑은 고딕" w:hint="eastAsia"/>
+          <w:color w:val="6E6E6E"/>
+          <w:sz w:val="18"/>
+          <w:szCs w:val="18"/>
+          <w:lang w:eastAsia="ko-KR"/>
+        </w:rPr>
+        <w:t xml:space="preserve"> mixed integer linear programming /</w:t>
+      </w:r>
+      <w:r>
+        <w:rPr>
+          <w:rFonts w:ascii="맑은 고딕" w:hAnsi="맑은 고딕" w:cs="맑은 고딕"/>
+          <w:color w:val="6E6E6E"/>
+          <w:sz w:val="18"/>
+          <w:szCs w:val="18"/>
+          <w:lang w:eastAsia="ko-KR"/>
+        </w:rPr>
+        <w:t xml:space="preserve"> stochastic programming / two-stage. 그들은 불확실성을 어떻게 다뤘고, 우리 아이디어는 무엇이 다른가요?</w:t>
       </w:r>
     </w:p>
     <w:tbl>
       <w:tblPr>
-        <w:tblW w:w="9412" w:type="dxa"/>
+        <w:tblW w:w="9391" w:type="dxa"/>
         <w:jc w:val="center"/>
         <w:tblBorders>
           <w:top w:val="single" w:sz="4" w:space="0" w:color="BBBBBB"/>
@@ -1007,20 +1095,20 @@
         <w:tblLook w:val="04A0" w:firstRow="1" w:lastRow="0" w:firstColumn="1" w:lastColumn="0" w:noHBand="0" w:noVBand="1"/>
       </w:tblPr>
       <w:tblGrid>
-        <w:gridCol w:w="2500"/>
-        <w:gridCol w:w="2400"/>
-        <w:gridCol w:w="2000"/>
-        <w:gridCol w:w="2512"/>
+        <w:gridCol w:w="3349"/>
+        <w:gridCol w:w="2678"/>
+        <w:gridCol w:w="3364"/>
       </w:tblGrid>
       <w:tr>
         <w:trPr>
           <w:cantSplit/>
+          <w:trHeight w:val="373"/>
           <w:tblHeader/>
           <w:jc w:val="center"/>
         </w:trPr>
         <w:tc>
           <w:tcPr>
-            <w:tcW w:w="2500" w:type="dxa"/>
+            <w:tcW w:w="3349" w:type="dxa"/>
             <w:shd w:val="clear" w:color="auto" w:fill="EEF2F8"/>
             <w:vAlign w:val="center"/>
           </w:tcPr>
@@ -1043,30 +1131,7 @@
         </w:tc>
         <w:tc>
           <w:tcPr>
-            <w:tcW w:w="2400" w:type="dxa"/>
-            <w:shd w:val="clear" w:color="auto" w:fill="EEF2F8"/>
-            <w:vAlign w:val="center"/>
-          </w:tcPr>
-          <w:p>
-            <w:pPr>
-              <w:spacing w:before="20" w:after="20" w:line="240" w:lineRule="auto"/>
-              <w:jc w:val="center"/>
-            </w:pPr>
-            <w:r>
-              <w:rPr>
-                <w:rFonts w:ascii="맑은 고딕" w:hAnsi="맑은 고딕" w:cs="맑은 고딕"/>
-                <w:b/>
-                <w:sz w:val="18"/>
-                <w:szCs w:val="18"/>
-                <w:lang w:eastAsia="ko-KR"/>
-              </w:rPr>
-              <w:t>다룬 문제와 불확실성</w:t>
-            </w:r>
-          </w:p>
-        </w:tc>
-        <w:tc>
-          <w:tcPr>
-            <w:tcW w:w="2000" w:type="dxa"/>
+            <w:tcW w:w="2678" w:type="dxa"/>
             <w:shd w:val="clear" w:color="auto" w:fill="EEF2F8"/>
             <w:vAlign w:val="center"/>
           </w:tcPr>
@@ -1089,7 +1154,7 @@
         </w:tc>
         <w:tc>
           <w:tcPr>
-            <w:tcW w:w="2512" w:type="dxa"/>
+            <w:tcW w:w="3364" w:type="dxa"/>
             <w:shd w:val="clear" w:color="auto" w:fill="EEF2F8"/>
             <w:vAlign w:val="center"/>
           </w:tcPr>
@@ -1117,11 +1182,12 @@
       <w:tr>
         <w:trPr>
           <w:cantSplit/>
+          <w:trHeight w:val="503"/>
           <w:jc w:val="center"/>
         </w:trPr>
         <w:tc>
           <w:tcPr>
-            <w:tcW w:w="2500" w:type="dxa"/>
+            <w:tcW w:w="3349" w:type="dxa"/>
           </w:tcPr>
           <w:p>
             <w:pPr>
@@ -1142,7 +1208,7 @@
         </w:tc>
         <w:tc>
           <w:tcPr>
-            <w:tcW w:w="2400" w:type="dxa"/>
+            <w:tcW w:w="2678" w:type="dxa"/>
           </w:tcPr>
           <w:p>
             <w:pPr>
@@ -1163,28 +1229,7 @@
         </w:tc>
         <w:tc>
           <w:tcPr>
-            <w:tcW w:w="2000" w:type="dxa"/>
-          </w:tcPr>
-          <w:p>
-            <w:pPr>
-              <w:spacing w:after="0" w:line="240" w:lineRule="auto"/>
-              <w:rPr>
-                <w:lang w:eastAsia="ko-KR"/>
-              </w:rPr>
-            </w:pPr>
-          </w:p>
-          <w:p>
-            <w:pPr>
-              <w:spacing w:after="0" w:line="240" w:lineRule="auto"/>
-              <w:rPr>
-                <w:lang w:eastAsia="ko-KR"/>
-              </w:rPr>
-            </w:pPr>
-          </w:p>
-        </w:tc>
-        <w:tc>
-          <w:tcPr>
-            <w:tcW w:w="2512" w:type="dxa"/>
+            <w:tcW w:w="3364" w:type="dxa"/>
           </w:tcPr>
           <w:p>
             <w:pPr>
@@ -1207,11 +1252,12 @@
       <w:tr>
         <w:trPr>
           <w:cantSplit/>
+          <w:trHeight w:val="503"/>
           <w:jc w:val="center"/>
         </w:trPr>
         <w:tc>
           <w:tcPr>
-            <w:tcW w:w="2500" w:type="dxa"/>
+            <w:tcW w:w="3349" w:type="dxa"/>
           </w:tcPr>
           <w:p>
             <w:pPr>
@@ -1232,7 +1278,7 @@
         </w:tc>
         <w:tc>
           <w:tcPr>
-            <w:tcW w:w="2400" w:type="dxa"/>
+            <w:tcW w:w="2678" w:type="dxa"/>
           </w:tcPr>
           <w:p>
             <w:pPr>
@@ -1253,28 +1299,7 @@
         </w:tc>
         <w:tc>
           <w:tcPr>
-            <w:tcW w:w="2000" w:type="dxa"/>
-          </w:tcPr>
-          <w:p>
-            <w:pPr>
-              <w:spacing w:after="0" w:line="240" w:lineRule="auto"/>
-              <w:rPr>
-                <w:lang w:eastAsia="ko-KR"/>
-              </w:rPr>
-            </w:pPr>
-          </w:p>
-          <w:p>
-            <w:pPr>
-              <w:spacing w:after="0" w:line="240" w:lineRule="auto"/>
-              <w:rPr>
-                <w:lang w:eastAsia="ko-KR"/>
-              </w:rPr>
-            </w:pPr>
-          </w:p>
-        </w:tc>
-        <w:tc>
-          <w:tcPr>
-            <w:tcW w:w="2512" w:type="dxa"/>
+            <w:tcW w:w="3364" w:type="dxa"/>
           </w:tcPr>
           <w:p>
             <w:pPr>
@@ -1297,11 +1322,12 @@
       <w:tr>
         <w:trPr>
           <w:cantSplit/>
+          <w:trHeight w:val="503"/>
           <w:jc w:val="center"/>
         </w:trPr>
         <w:tc>
           <w:tcPr>
-            <w:tcW w:w="2500" w:type="dxa"/>
+            <w:tcW w:w="3349" w:type="dxa"/>
           </w:tcPr>
           <w:p>
             <w:pPr>
@@ -1322,7 +1348,7 @@
         </w:tc>
         <w:tc>
           <w:tcPr>
-            <w:tcW w:w="2400" w:type="dxa"/>
+            <w:tcW w:w="2678" w:type="dxa"/>
           </w:tcPr>
           <w:p>
             <w:pPr>
@@ -1343,28 +1369,7 @@
         </w:tc>
         <w:tc>
           <w:tcPr>
-            <w:tcW w:w="2000" w:type="dxa"/>
-          </w:tcPr>
-          <w:p>
-            <w:pPr>
-              <w:spacing w:after="0" w:line="240" w:lineRule="auto"/>
-              <w:rPr>
-                <w:lang w:eastAsia="ko-KR"/>
-              </w:rPr>
-            </w:pPr>
-          </w:p>
-          <w:p>
-            <w:pPr>
-              <w:spacing w:after="0" w:line="240" w:lineRule="auto"/>
-              <w:rPr>
-                <w:lang w:eastAsia="ko-KR"/>
-              </w:rPr>
-            </w:pPr>
-          </w:p>
-        </w:tc>
-        <w:tc>
-          <w:tcPr>
-            <w:tcW w:w="2512" w:type="dxa"/>
+            <w:tcW w:w="3364" w:type="dxa"/>
           </w:tcPr>
           <w:p>
             <w:pPr>

</xml_diff>

<commit_message>
Pitch template moves to 10/27 and centres on integer programming
The pitch is now on 10/27 (Tue). Uncertainty becomes an optional
section 4, and a new section 3 drafts the model: a notation table
with the week-6 LAP as the example (parameters marked deterministic
or stochastic) and a Minimize / Maximize ... s.t. template like the
midterm's. A "why integer programming" prompt joins section 2, the
pitch sentence no longer assumes uncertainty, and class terms are in
English. The PDF is re-exported from the Word file.

Co-Authored-By: Claude Opus 5.5 <noreply@anthropic.com>
</commit_message>
<xml_diff>
--- a/final-project/OL7014_project_template.docx
+++ b/final-project/OL7014_project_template.docx
@@ -80,7 +80,7 @@
           <w:szCs w:val="18"/>
           <w:lang w:eastAsia="ko-KR"/>
         </w:rPr>
-        <w:t>발표: 10월 1</w:t>
+        <w:t>발표: 10월 2</w:t>
       </w:r>
       <w:r>
         <w:rPr>
@@ -90,7 +90,7 @@
           <w:szCs w:val="18"/>
           <w:lang w:eastAsia="ko-KR"/>
         </w:rPr>
-        <w:t>3</w:t>
+        <w:t>7</w:t>
       </w:r>
       <w:r>
         <w:rPr>
@@ -337,7 +337,7 @@
           <w:sz w:val="22"/>
           <w:lang w:eastAsia="ko-KR"/>
         </w:rPr>
-        <w:t>2.  최적화 모형으로 본 문제</w:t>
+        <w:t>2.  최적화 모델로 본 문제</w:t>
       </w:r>
       <w:r>
         <w:rPr>
@@ -380,7 +380,7 @@
           <w:szCs w:val="18"/>
           <w:lang w:eastAsia="ko-KR"/>
         </w:rPr>
-        <w:t>결정변수(decision variables) — 무엇을 정하나요? 예/아니오(이진), 개수(정수), 양(연속) 중 어느 것인가요?</w:t>
+        <w:t xml:space="preserve">Decision variables — 무엇을 정하나요? 예/아니오(binary), 개수(integer), 양(continuous) 중 어느 것인가요?</w:t>
       </w:r>
     </w:p>
     <w:tbl>
@@ -461,27 +461,7 @@
           <w:szCs w:val="18"/>
           <w:lang w:eastAsia="ko-KR"/>
         </w:rPr>
-        <w:t>목적함수(objective) — 개선하려는 하나의 숫자(비용, 시간, 피해, 충족률 등). 목표가 여러 개라면 하나를 골라 최적화하고, 나머지는 어떻게 다룰지(예: 제약</w:t>
-      </w:r>
-      <w:r>
-        <w:rPr>
-          <w:rFonts w:ascii="맑은 고딕" w:hAnsi="맑은 고딕" w:cs="맑은 고딕" w:hint="eastAsia"/>
-          <w:color w:val="6E6E6E"/>
-          <w:sz w:val="18"/>
-          <w:szCs w:val="18"/>
-          <w:lang w:eastAsia="ko-KR"/>
-        </w:rPr>
-        <w:t>식으로 표현하기, 예 충족률 80%이상</w:t>
-      </w:r>
-      <w:r>
-        <w:rPr>
-          <w:rFonts w:ascii="맑은 고딕" w:hAnsi="맑은 고딕" w:cs="맑은 고딕"/>
-          <w:color w:val="6E6E6E"/>
-          <w:sz w:val="18"/>
-          <w:szCs w:val="18"/>
-          <w:lang w:eastAsia="ko-KR"/>
-        </w:rPr>
-        <w:t>) 적으세요.</w:t>
+        <w:t xml:space="preserve">Objective function — 개선하려는 하나의 숫자(비용, 시간, 피해, 충족률 등). 목표가 여러 개라면 하나를 골라 최적화하고, 나머지는 어떻게 다룰지(예: constraint로 표현하기, 예 충족률 80%이상) 적으세요.</w:t>
       </w:r>
     </w:p>
     <w:tbl>
@@ -562,7 +542,7 @@
           <w:szCs w:val="18"/>
           <w:lang w:eastAsia="ko-KR"/>
         </w:rPr>
-        <w:t>제약조건(constraints) — 결정을 제한하는 것은? 예산·용량, 규정·교리, 시스템의 물리적 한계. 2–4개, 각각 한 문장.</w:t>
+        <w:t xml:space="preserve">Constraints — 결정을 제한하는 것은? 예산·용량, 규정·교리, 시스템의 물리적 한계, 그리고 “A를 하면 B도 해야 한다”, “둘 중 하나만”, “쓰면 고정비가 든다” 같은 logical conditions. 2–4개, 각각 한 문장.</w:t>
       </w:r>
     </w:p>
     <w:tbl>
@@ -651,27 +631,7 @@
           <w:szCs w:val="18"/>
           <w:lang w:eastAsia="ko-KR"/>
         </w:rPr>
-        <w:t>모형을 쓰기 전에 알아야 하는 값 — 비용, 수요, 거리, 용량, 네트워크 등. 이 중 실제로는 미리 정확히 알 수 없는 값에 표시해 두세요(→ 3번</w:t>
-      </w:r>
-      <w:r>
-        <w:rPr>
-          <w:rFonts w:ascii="맑은 고딕" w:hAnsi="맑은 고딕" w:cs="맑은 고딕" w:hint="eastAsia"/>
-          <w:color w:val="6E6E6E"/>
-          <w:sz w:val="18"/>
-          <w:szCs w:val="18"/>
-          <w:lang w:eastAsia="ko-KR"/>
-        </w:rPr>
-        <w:t>에서 구체화</w:t>
-      </w:r>
-      <w:r>
-        <w:rPr>
-          <w:rFonts w:ascii="맑은 고딕" w:hAnsi="맑은 고딕" w:cs="맑은 고딕"/>
-          <w:color w:val="6E6E6E"/>
-          <w:sz w:val="18"/>
-          <w:szCs w:val="18"/>
-          <w:lang w:eastAsia="ko-KR"/>
-        </w:rPr>
-        <w:t>).</w:t>
+        <w:t xml:space="preserve">모델을 쓰기 전에 알아야 하는 값 — 비용, 수요, 거리, 용량, 네트워크 등. 이 중 실제로는 미리 정확히 알 수 없는 값이 있다면 표시해 두세요(→ 4번, 선택).</w:t>
       </w:r>
     </w:p>
     <w:tbl>
@@ -721,6 +681,87 @@
     <w:p>
       <w:pPr>
         <w:keepNext/>
+        <w:spacing w:before="100" w:after="20" w:line="240" w:lineRule="auto"/>
+        <w:rPr>
+          <w:lang w:eastAsia="ko-KR"/>
+        </w:rPr>
+      </w:pPr>
+      <w:r>
+        <w:rPr>
+          <w:rFonts w:ascii="맑은 고딕" w:hAnsi="맑은 고딕" w:cs="맑은 고딕"/>
+          <w:b/>
+          <w:szCs w:val="20"/>
+          <w:lang w:eastAsia="ko-KR"/>
+        </w:rPr>
+        <w:t xml:space="preserve">왜 integer programming인가 …</w:t>
+      </w:r>
+    </w:p>
+    <w:p>
+      <w:pPr>
+        <w:keepNext/>
+        <w:spacing w:after="60" w:line="240" w:lineRule="auto"/>
+        <w:rPr>
+          <w:lang w:eastAsia="ko-KR"/>
+        </w:rPr>
+      </w:pPr>
+      <w:r>
+        <w:rPr>
+          <w:rFonts w:ascii="맑은 고딕" w:hAnsi="맑은 고딕" w:cs="맑은 고딕"/>
+          <w:color w:val="6E6E6E"/>
+          <w:sz w:val="18"/>
+          <w:szCs w:val="18"/>
+          <w:lang w:eastAsia="ko-KR"/>
+        </w:rPr>
+        <w:t xml:space="preserve">어떤 변수가 integer·binary여야 하나요? integrality 조건을 빼고 LP relaxation을 푼 뒤 rounding하면 무엇이 문제인가요(infeasible, 큰 손실 등)? 수업에서 다룬 모델(knapsack, assignment, transportation, shortest path, max flow, facility location, fixed charge, location–allocation 등) 중 어느 것과 닮았나요?</w:t>
+      </w:r>
+    </w:p>
+    <w:tbl>
+      <w:tblPr>
+        <w:tblW w:w="9412" w:type="dxa"/>
+        <w:jc w:val="center"/>
+        <w:tblBorders>
+          <w:top w:val="single" w:sz="4" w:space="0" w:color="BBBBBB"/>
+          <w:left w:val="single" w:sz="4" w:space="0" w:color="BBBBBB"/>
+          <w:bottom w:val="single" w:sz="4" w:space="0" w:color="BBBBBB"/>
+          <w:right w:val="single" w:sz="4" w:space="0" w:color="BBBBBB"/>
+        </w:tblBorders>
+        <w:tblLayout w:type="fixed"/>
+        <w:tblLook w:val="04A0" w:firstRow="1" w:lastRow="0" w:firstColumn="1" w:lastColumn="0" w:noHBand="0" w:noVBand="1"/>
+      </w:tblPr>
+      <w:tblGrid>
+        <w:gridCol w:w="9412"/>
+      </w:tblGrid>
+      <w:tr>
+        <w:trPr>
+          <w:cantSplit/>
+          <w:jc w:val="center"/>
+        </w:trPr>
+        <w:tc>
+          <w:tcPr>
+            <w:tcW w:w="9412" w:type="dxa"/>
+          </w:tcPr>
+          <w:p>
+            <w:pPr>
+              <w:spacing w:after="0" w:line="240" w:lineRule="auto"/>
+              <w:rPr>
+                <w:lang w:eastAsia="ko-KR"/>
+              </w:rPr>
+            </w:pPr>
+          </w:p>
+          <w:p>
+            <w:pPr>
+              <w:spacing w:after="0" w:line="240" w:lineRule="auto"/>
+              <w:rPr>
+                <w:lang w:eastAsia="ko-KR"/>
+              </w:rPr>
+            </w:pPr>
+          </w:p>
+        </w:tc>
+      </w:tr>
+    </w:tbl>
+    <w:p>
+      <w:pPr>
+        <w:keepNext/>
         <w:pageBreakBefore/>
         <w:pBdr>
           <w:top w:val="single" w:sz="8" w:space="4" w:color="12448C"/>
@@ -740,8 +781,1451 @@
           <w:sz w:val="22"/>
           <w:lang w:eastAsia="ko-KR"/>
         </w:rPr>
+        <w:t xml:space="preserve">3.  최적화 모델 초안</w:t>
+      </w:r>
+    </w:p>
+    <w:p>
+      <w:pPr>
+        <w:keepNext/>
+        <w:spacing w:before="100" w:after="20" w:line="240" w:lineRule="auto"/>
+        <w:rPr>
+          <w:lang w:eastAsia="ko-KR"/>
+        </w:rPr>
+      </w:pPr>
+      <w:r>
+        <w:rPr>
+          <w:rFonts w:ascii="맑은 고딕" w:hAnsi="맑은 고딕" w:cs="맑은 고딕"/>
+          <w:b/>
+          <w:szCs w:val="20"/>
+          <w:lang w:eastAsia="ko-KR"/>
+        </w:rPr>
+        <w:t xml:space="preserve">Notation …</w:t>
+      </w:r>
+    </w:p>
+    <w:p>
+      <w:pPr>
+        <w:keepNext/>
+        <w:spacing w:after="60" w:line="240" w:lineRule="auto"/>
+        <w:rPr>
+          <w:lang w:eastAsia="ko-KR"/>
+        </w:rPr>
+      </w:pPr>
+      <w:r>
+        <w:rPr>
+          <w:rFonts w:ascii="맑은 고딕" w:hAnsi="맑은 고딕" w:cs="맑은 고딕"/>
+          <w:color w:val="6E6E6E"/>
+          <w:sz w:val="18"/>
+          <w:szCs w:val="18"/>
+          <w:lang w:eastAsia="ko-KR"/>
+        </w:rPr>
+        <w:t xml:space="preserve">Index sets, decision variables, parameters(데이터)를 정의하세요. Parameter마다 deterministic인지, stochastic인지, 둘 다 가능한지 표시하세요. 오른쪽 회색 글씨는 예시입니다.</w:t>
+      </w:r>
+    </w:p>
+    <w:tbl>
+      <w:tblPr>
+        <w:tblW w:w="9412" w:type="dxa"/>
+        <w:jc w:val="center"/>
+        <w:tblBorders>
+          <w:top w:val="single" w:sz="4" w:space="0" w:color="BBBBBB"/>
+          <w:left w:val="single" w:sz="4" w:space="0" w:color="BBBBBB"/>
+          <w:bottom w:val="single" w:sz="4" w:space="0" w:color="BBBBBB"/>
+          <w:right w:val="single" w:sz="4" w:space="0" w:color="BBBBBB"/>
+          <w:insideH w:val="single" w:sz="4" w:space="0" w:color="BBBBBB"/>
+          <w:insideV w:val="single" w:sz="4" w:space="0" w:color="BBBBBB"/>
+        </w:tblBorders>
+        <w:tblLayout w:type="fixed"/>
+        <w:tblLook w:val="04A0" w:firstRow="1" w:lastRow="0" w:firstColumn="1" w:lastColumn="0" w:noHBand="0" w:noVBand="1"/>
+      </w:tblPr>
+      <w:tblGrid>
+        <w:gridCol w:w="5612"/>
+        <w:gridCol w:w="3800"/>
+      </w:tblGrid>
+      <w:tr>
+        <w:trPr>
+          <w:cantSplit/>
+          <w:tblHeader/>
+          <w:jc w:val="center"/>
+        </w:trPr>
+        <w:tc>
+          <w:tcPr>
+            <w:tcW w:w="5612" w:type="dxa"/>
+            <w:shd w:val="clear" w:color="auto" w:fill="EEF2F8"/>
+            <w:vAlign w:val="center"/>
+          </w:tcPr>
+          <w:p>
+            <w:pPr>
+              <w:spacing w:before="20" w:after="0" w:line="240" w:lineRule="auto"/>
+              <w:jc w:val="center"/>
+              <w:rPr>
+                <w:lang w:eastAsia="ko-KR"/>
+              </w:rPr>
+            </w:pPr>
+            <w:r>
+              <w:rPr>
+                <w:rFonts w:ascii="맑은 고딕" w:hAnsi="맑은 고딕" w:cs="맑은 고딕"/>
+                <w:b/>
+                <w:sz w:val="18"/>
+                <w:szCs w:val="18"/>
+                <w:lang w:eastAsia="ko-KR"/>
+              </w:rPr>
+              <w:t xml:space="preserve">기호와 의미</w:t>
+            </w:r>
+          </w:p>
+        </w:tc>
+        <w:tc>
+          <w:tcPr>
+            <w:tcW w:w="3800" w:type="dxa"/>
+            <w:shd w:val="clear" w:color="auto" w:fill="EEF2F8"/>
+            <w:vAlign w:val="center"/>
+          </w:tcPr>
+          <w:p>
+            <w:pPr>
+              <w:spacing w:before="20" w:after="0" w:line="240" w:lineRule="auto"/>
+              <w:jc w:val="center"/>
+              <w:rPr>
+                <w:lang w:eastAsia="ko-KR"/>
+              </w:rPr>
+            </w:pPr>
+            <w:r>
+              <w:rPr>
+                <w:rFonts w:ascii="맑은 고딕" w:hAnsi="맑은 고딕" w:cs="맑은 고딕"/>
+                <w:b/>
+                <w:sz w:val="18"/>
+                <w:szCs w:val="18"/>
+                <w:lang w:eastAsia="ko-KR"/>
+              </w:rPr>
+              <w:t xml:space="preserve">예시 (Location Allocation Problem)</w:t>
+            </w:r>
+          </w:p>
+        </w:tc>
+      </w:tr>
+      <w:tr>
+        <w:trPr>
+          <w:cantSplit/>
+          <w:jc w:val="center"/>
+        </w:trPr>
+        <w:tc>
+          <w:tcPr>
+            <w:tcW w:w="5612" w:type="dxa"/>
+            <w:vAlign w:val="top"/>
+          </w:tcPr>
+          <w:p>
+            <w:pPr>
+              <w:spacing w:before="20" w:after="0" w:line="240" w:lineRule="auto"/>
+              <w:rPr>
+                <w:lang w:eastAsia="ko-KR"/>
+              </w:rPr>
+            </w:pPr>
+            <w:r>
+              <w:rPr>
+                <w:rFonts w:ascii="맑은 고딕" w:hAnsi="맑은 고딕" w:cs="맑은 고딕"/>
+                <w:b/>
+                <w:sz w:val="18"/>
+                <w:szCs w:val="18"/>
+                <w:lang w:eastAsia="ko-KR"/>
+              </w:rPr>
+              <w:t xml:space="preserve">Index sets</w:t>
+            </w:r>
+          </w:p>
+          <w:p>
+            <w:pPr>
+              <w:spacing w:before="20" w:after="0" w:line="240" w:lineRule="auto"/>
+              <w:rPr>
+                <w:lang w:eastAsia="ko-KR"/>
+              </w:rPr>
+            </w:pPr>
+          </w:p>
+          <w:p>
+            <w:pPr>
+              <w:spacing w:before="20" w:after="0" w:line="240" w:lineRule="auto"/>
+              <w:rPr>
+                <w:lang w:eastAsia="ko-KR"/>
+              </w:rPr>
+            </w:pPr>
+          </w:p>
+        </w:tc>
+        <w:tc>
+          <w:tcPr>
+            <w:tcW w:w="3800" w:type="dxa"/>
+            <w:vAlign w:val="top"/>
+          </w:tcPr>
+          <w:p>
+            <w:pPr>
+              <w:spacing w:before="20" w:after="20" w:line="240" w:lineRule="auto"/>
+              <w:rPr>
+                <w:lang w:eastAsia="ko-KR"/>
+              </w:rPr>
+            </w:pPr>
+            <w:r>
+              <w:rPr>
+                <w:rFonts w:ascii="맑은 고딕" w:hAnsi="맑은 고딕" w:cs="맑은 고딕"/>
+                <w:color w:val="6E6E6E"/>
+                <w:sz w:val="16"/>
+                <w:szCs w:val="16"/>
+                <w:lang w:eastAsia="ko-KR"/>
+              </w:rPr>
+              <w:t xml:space="preserve">V : 노드 집합, i ∈ V</w:t>
+            </w:r>
+          </w:p>
+          <w:p>
+            <w:pPr>
+              <w:spacing w:before="20" w:after="20" w:line="240" w:lineRule="auto"/>
+              <w:rPr>
+                <w:lang w:eastAsia="ko-KR"/>
+              </w:rPr>
+            </w:pPr>
+            <w:r>
+              <w:rPr>
+                <w:rFonts w:ascii="맑은 고딕" w:hAnsi="맑은 고딕" w:cs="맑은 고딕"/>
+                <w:color w:val="6E6E6E"/>
+                <w:sz w:val="16"/>
+                <w:szCs w:val="16"/>
+                <w:lang w:eastAsia="ko-KR"/>
+              </w:rPr>
+              <w:t xml:space="preserve">E : 아크 집합, (i,j) ∈ E</w:t>
+            </w:r>
+          </w:p>
+        </w:tc>
+      </w:tr>
+      <w:tr>
+        <w:trPr>
+          <w:cantSplit/>
+          <w:jc w:val="center"/>
+        </w:trPr>
+        <w:tc>
+          <w:tcPr>
+            <w:tcW w:w="5612" w:type="dxa"/>
+            <w:vAlign w:val="top"/>
+          </w:tcPr>
+          <w:p>
+            <w:pPr>
+              <w:spacing w:before="20" w:after="0" w:line="240" w:lineRule="auto"/>
+              <w:rPr>
+                <w:lang w:eastAsia="ko-KR"/>
+              </w:rPr>
+            </w:pPr>
+            <w:r>
+              <w:rPr>
+                <w:rFonts w:ascii="맑은 고딕" w:hAnsi="맑은 고딕" w:cs="맑은 고딕"/>
+                <w:b/>
+                <w:sz w:val="18"/>
+                <w:szCs w:val="18"/>
+                <w:lang w:eastAsia="ko-KR"/>
+              </w:rPr>
+              <w:t xml:space="preserve">Decision variables</w:t>
+            </w:r>
+          </w:p>
+          <w:p>
+            <w:pPr>
+              <w:spacing w:before="20" w:after="0" w:line="240" w:lineRule="auto"/>
+              <w:rPr>
+                <w:lang w:eastAsia="ko-KR"/>
+              </w:rPr>
+            </w:pPr>
+          </w:p>
+          <w:p>
+            <w:pPr>
+              <w:spacing w:before="20" w:after="0" w:line="240" w:lineRule="auto"/>
+              <w:rPr>
+                <w:lang w:eastAsia="ko-KR"/>
+              </w:rPr>
+            </w:pPr>
+          </w:p>
+          <w:p>
+            <w:pPr>
+              <w:spacing w:before="20" w:after="0" w:line="240" w:lineRule="auto"/>
+              <w:rPr>
+                <w:lang w:eastAsia="ko-KR"/>
+              </w:rPr>
+            </w:pPr>
+          </w:p>
+          <w:p>
+            <w:pPr>
+              <w:spacing w:before="20" w:after="0" w:line="240" w:lineRule="auto"/>
+              <w:rPr>
+                <w:lang w:eastAsia="ko-KR"/>
+              </w:rPr>
+            </w:pPr>
+          </w:p>
+        </w:tc>
+        <w:tc>
+          <w:tcPr>
+            <w:tcW w:w="3800" w:type="dxa"/>
+            <w:vAlign w:val="top"/>
+          </w:tcPr>
+          <w:p>
+            <w:pPr>
+              <w:spacing w:before="20" w:after="20" w:line="240" w:lineRule="auto"/>
+              <w:rPr>
+                <w:lang w:eastAsia="ko-KR"/>
+              </w:rPr>
+            </w:pPr>
+            <w:r>
+              <w:rPr>
+                <w:rFonts w:ascii="맑은 고딕" w:hAnsi="맑은 고딕" w:cs="맑은 고딕"/>
+                <w:color w:val="6E6E6E"/>
+                <w:sz w:val="16"/>
+                <w:szCs w:val="16"/>
+                <w:lang w:eastAsia="ko-KR"/>
+              </w:rPr>
+              <w:t xml:space="preserve">x</w:t>
+            </w:r>
+            <w:r>
+              <w:rPr>
+                <w:rFonts w:ascii="맑은 고딕" w:hAnsi="맑은 고딕" w:cs="맑은 고딕"/>
+                <w:color w:val="6E6E6E"/>
+                <w:vertAlign w:val="subscript"/>
+                <w:sz w:val="16"/>
+                <w:szCs w:val="16"/>
+                <w:lang w:eastAsia="ko-KR"/>
+              </w:rPr>
+              <w:t xml:space="preserve">i</w:t>
+            </w:r>
+            <w:r>
+              <w:rPr>
+                <w:rFonts w:ascii="맑은 고딕" w:hAnsi="맑은 고딕" w:cs="맑은 고딕"/>
+                <w:color w:val="6E6E6E"/>
+                <w:sz w:val="16"/>
+                <w:szCs w:val="16"/>
+                <w:lang w:eastAsia="ko-KR"/>
+              </w:rPr>
+              <w:t xml:space="preserve"> : 노드 i에 시설 개설 여부 (binary)</w:t>
+            </w:r>
+          </w:p>
+          <w:p>
+            <w:pPr>
+              <w:spacing w:before="20" w:after="20" w:line="240" w:lineRule="auto"/>
+              <w:rPr>
+                <w:lang w:eastAsia="ko-KR"/>
+              </w:rPr>
+            </w:pPr>
+            <w:r>
+              <w:rPr>
+                <w:rFonts w:ascii="맑은 고딕" w:hAnsi="맑은 고딕" w:cs="맑은 고딕"/>
+                <w:color w:val="6E6E6E"/>
+                <w:sz w:val="16"/>
+                <w:szCs w:val="16"/>
+                <w:lang w:eastAsia="ko-KR"/>
+              </w:rPr>
+              <w:t xml:space="preserve">r</w:t>
+            </w:r>
+            <w:r>
+              <w:rPr>
+                <w:rFonts w:ascii="맑은 고딕" w:hAnsi="맑은 고딕" w:cs="맑은 고딕"/>
+                <w:color w:val="6E6E6E"/>
+                <w:vertAlign w:val="subscript"/>
+                <w:sz w:val="16"/>
+                <w:szCs w:val="16"/>
+                <w:lang w:eastAsia="ko-KR"/>
+              </w:rPr>
+              <w:t xml:space="preserve">i</w:t>
+            </w:r>
+            <w:r>
+              <w:rPr>
+                <w:rFonts w:ascii="맑은 고딕" w:hAnsi="맑은 고딕" w:cs="맑은 고딕"/>
+                <w:color w:val="6E6E6E"/>
+                <w:sz w:val="16"/>
+                <w:szCs w:val="16"/>
+                <w:lang w:eastAsia="ko-KR"/>
+              </w:rPr>
+              <w:t xml:space="preserve"> : 노드 i에 비축하는 재고량 (continuous)</w:t>
+            </w:r>
+          </w:p>
+          <w:p>
+            <w:pPr>
+              <w:spacing w:before="20" w:after="20" w:line="240" w:lineRule="auto"/>
+              <w:rPr>
+                <w:lang w:eastAsia="ko-KR"/>
+              </w:rPr>
+            </w:pPr>
+            <w:r>
+              <w:rPr>
+                <w:rFonts w:ascii="맑은 고딕" w:hAnsi="맑은 고딕" w:cs="맑은 고딕"/>
+                <w:color w:val="6E6E6E"/>
+                <w:sz w:val="16"/>
+                <w:szCs w:val="16"/>
+                <w:lang w:eastAsia="ko-KR"/>
+              </w:rPr>
+              <w:t xml:space="preserve">y</w:t>
+            </w:r>
+            <w:r>
+              <w:rPr>
+                <w:rFonts w:ascii="맑은 고딕" w:hAnsi="맑은 고딕" w:cs="맑은 고딕"/>
+                <w:color w:val="6E6E6E"/>
+                <w:vertAlign w:val="subscript"/>
+                <w:sz w:val="16"/>
+                <w:szCs w:val="16"/>
+                <w:lang w:eastAsia="ko-KR"/>
+              </w:rPr>
+              <w:t xml:space="preserve">ij</w:t>
+            </w:r>
+            <w:r>
+              <w:rPr>
+                <w:rFonts w:ascii="맑은 고딕" w:hAnsi="맑은 고딕" w:cs="맑은 고딕"/>
+                <w:color w:val="6E6E6E"/>
+                <w:sz w:val="16"/>
+                <w:szCs w:val="16"/>
+                <w:lang w:eastAsia="ko-KR"/>
+              </w:rPr>
+              <w:t xml:space="preserve"> : 아크 (i,j)로 보내는 양 (continuous)</w:t>
+            </w:r>
+          </w:p>
+          <w:p>
+            <w:pPr>
+              <w:spacing w:before="20" w:after="20" w:line="240" w:lineRule="auto"/>
+              <w:rPr>
+                <w:lang w:eastAsia="ko-KR"/>
+              </w:rPr>
+            </w:pPr>
+            <w:r>
+              <w:rPr>
+                <w:rFonts w:ascii="맑은 고딕" w:hAnsi="맑은 고딕" w:cs="맑은 고딕"/>
+                <w:color w:val="6E6E6E"/>
+                <w:sz w:val="16"/>
+                <w:szCs w:val="16"/>
+                <w:lang w:eastAsia="ko-KR"/>
+              </w:rPr>
+              <w:t xml:space="preserve">q</w:t>
+            </w:r>
+            <w:r>
+              <w:rPr>
+                <w:rFonts w:ascii="맑은 고딕" w:hAnsi="맑은 고딕" w:cs="맑은 고딕"/>
+                <w:color w:val="6E6E6E"/>
+                <w:vertAlign w:val="subscript"/>
+                <w:sz w:val="16"/>
+                <w:szCs w:val="16"/>
+                <w:lang w:eastAsia="ko-KR"/>
+              </w:rPr>
+              <w:t xml:space="preserve">i</w:t>
+            </w:r>
+            <w:r>
+              <w:rPr>
+                <w:rFonts w:ascii="맑은 고딕" w:hAnsi="맑은 고딕" w:cs="맑은 고딕"/>
+                <w:color w:val="6E6E6E"/>
+                <w:sz w:val="16"/>
+                <w:szCs w:val="16"/>
+                <w:lang w:eastAsia="ko-KR"/>
+              </w:rPr>
+              <w:t xml:space="preserve"> : 노드 i의 미충족 수요 (continuous)</w:t>
+            </w:r>
+          </w:p>
+          <w:p>
+            <w:pPr>
+              <w:spacing w:before="20" w:after="20" w:line="240" w:lineRule="auto"/>
+              <w:rPr>
+                <w:lang w:eastAsia="ko-KR"/>
+              </w:rPr>
+            </w:pPr>
+            <w:r>
+              <w:rPr>
+                <w:rFonts w:ascii="맑은 고딕" w:hAnsi="맑은 고딕" w:cs="맑은 고딕"/>
+                <w:color w:val="6E6E6E"/>
+                <w:sz w:val="16"/>
+                <w:szCs w:val="16"/>
+                <w:lang w:eastAsia="ko-KR"/>
+              </w:rPr>
+              <w:t xml:space="preserve">s</w:t>
+            </w:r>
+            <w:r>
+              <w:rPr>
+                <w:rFonts w:ascii="맑은 고딕" w:hAnsi="맑은 고딕" w:cs="맑은 고딕"/>
+                <w:color w:val="6E6E6E"/>
+                <w:vertAlign w:val="subscript"/>
+                <w:sz w:val="16"/>
+                <w:szCs w:val="16"/>
+                <w:lang w:eastAsia="ko-KR"/>
+              </w:rPr>
+              <w:t xml:space="preserve">i</w:t>
+            </w:r>
+            <w:r>
+              <w:rPr>
+                <w:rFonts w:ascii="맑은 고딕" w:hAnsi="맑은 고딕" w:cs="맑은 고딕"/>
+                <w:color w:val="6E6E6E"/>
+                <w:sz w:val="16"/>
+                <w:szCs w:val="16"/>
+                <w:lang w:eastAsia="ko-KR"/>
+              </w:rPr>
+              <w:t xml:space="preserve"> : 노드 i의 잉여 재고 (continuous)</w:t>
+            </w:r>
+          </w:p>
+        </w:tc>
+      </w:tr>
+      <w:tr>
+        <w:trPr>
+          <w:cantSplit/>
+          <w:jc w:val="center"/>
+        </w:trPr>
+        <w:tc>
+          <w:tcPr>
+            <w:tcW w:w="5612" w:type="dxa"/>
+            <w:vAlign w:val="top"/>
+          </w:tcPr>
+          <w:p>
+            <w:pPr>
+              <w:spacing w:before="20" w:after="0" w:line="240" w:lineRule="auto"/>
+              <w:rPr>
+                <w:lang w:eastAsia="ko-KR"/>
+              </w:rPr>
+            </w:pPr>
+            <w:r>
+              <w:rPr>
+                <w:rFonts w:ascii="맑은 고딕" w:hAnsi="맑은 고딕" w:cs="맑은 고딕"/>
+                <w:b/>
+                <w:sz w:val="18"/>
+                <w:szCs w:val="18"/>
+                <w:lang w:eastAsia="ko-KR"/>
+              </w:rPr>
+              <w:t xml:space="preserve">Parameters (data)</w:t>
+            </w:r>
+          </w:p>
+          <w:p>
+            <w:pPr>
+              <w:spacing w:before="20" w:after="0" w:line="240" w:lineRule="auto"/>
+              <w:rPr>
+                <w:lang w:eastAsia="ko-KR"/>
+              </w:rPr>
+            </w:pPr>
+          </w:p>
+          <w:p>
+            <w:pPr>
+              <w:spacing w:before="20" w:after="0" w:line="240" w:lineRule="auto"/>
+              <w:rPr>
+                <w:lang w:eastAsia="ko-KR"/>
+              </w:rPr>
+            </w:pPr>
+          </w:p>
+          <w:p>
+            <w:pPr>
+              <w:spacing w:before="20" w:after="0" w:line="240" w:lineRule="auto"/>
+              <w:rPr>
+                <w:lang w:eastAsia="ko-KR"/>
+              </w:rPr>
+            </w:pPr>
+          </w:p>
+          <w:p>
+            <w:pPr>
+              <w:spacing w:before="20" w:after="0" w:line="240" w:lineRule="auto"/>
+              <w:rPr>
+                <w:lang w:eastAsia="ko-KR"/>
+              </w:rPr>
+            </w:pPr>
+          </w:p>
+          <w:p>
+            <w:pPr>
+              <w:spacing w:before="20" w:after="0" w:line="240" w:lineRule="auto"/>
+              <w:rPr>
+                <w:lang w:eastAsia="ko-KR"/>
+              </w:rPr>
+            </w:pPr>
+          </w:p>
+          <w:p>
+            <w:pPr>
+              <w:spacing w:before="20" w:after="0" w:line="240" w:lineRule="auto"/>
+              <w:rPr>
+                <w:lang w:eastAsia="ko-KR"/>
+              </w:rPr>
+            </w:pPr>
+          </w:p>
+        </w:tc>
+        <w:tc>
+          <w:tcPr>
+            <w:tcW w:w="3800" w:type="dxa"/>
+            <w:vAlign w:val="top"/>
+          </w:tcPr>
+          <w:p>
+            <w:pPr>
+              <w:spacing w:before="20" w:after="20" w:line="240" w:lineRule="auto"/>
+              <w:rPr>
+                <w:lang w:eastAsia="ko-KR"/>
+              </w:rPr>
+            </w:pPr>
+            <w:r>
+              <w:rPr>
+                <w:rFonts w:ascii="맑은 고딕" w:hAnsi="맑은 고딕" w:cs="맑은 고딕"/>
+                <w:color w:val="6E6E6E"/>
+                <w:sz w:val="16"/>
+                <w:szCs w:val="16"/>
+                <w:lang w:eastAsia="ko-KR"/>
+              </w:rPr>
+              <w:t xml:space="preserve">d</w:t>
+            </w:r>
+            <w:r>
+              <w:rPr>
+                <w:rFonts w:ascii="맑은 고딕" w:hAnsi="맑은 고딕" w:cs="맑은 고딕"/>
+                <w:color w:val="6E6E6E"/>
+                <w:vertAlign w:val="subscript"/>
+                <w:sz w:val="16"/>
+                <w:szCs w:val="16"/>
+                <w:lang w:eastAsia="ko-KR"/>
+              </w:rPr>
+              <w:t xml:space="preserve">i</w:t>
+            </w:r>
+            <w:r>
+              <w:rPr>
+                <w:rFonts w:ascii="맑은 고딕" w:hAnsi="맑은 고딕" w:cs="맑은 고딕"/>
+                <w:color w:val="6E6E6E"/>
+                <w:sz w:val="16"/>
+                <w:szCs w:val="16"/>
+                <w:lang w:eastAsia="ko-KR"/>
+              </w:rPr>
+              <w:t xml:space="preserve"> : 노드 i의 수요 (deterministic / stochastic)</w:t>
+            </w:r>
+          </w:p>
+          <w:p>
+            <w:pPr>
+              <w:spacing w:before="20" w:after="20" w:line="240" w:lineRule="auto"/>
+              <w:rPr>
+                <w:lang w:eastAsia="ko-KR"/>
+              </w:rPr>
+            </w:pPr>
+            <w:r>
+              <w:rPr>
+                <w:rFonts w:ascii="맑은 고딕" w:hAnsi="맑은 고딕" w:cs="맑은 고딕"/>
+                <w:color w:val="6E6E6E"/>
+                <w:sz w:val="16"/>
+                <w:szCs w:val="16"/>
+                <w:lang w:eastAsia="ko-KR"/>
+              </w:rPr>
+              <w:t xml:space="preserve">c</w:t>
+            </w:r>
+            <w:r>
+              <w:rPr>
+                <w:rFonts w:ascii="맑은 고딕" w:hAnsi="맑은 고딕" w:cs="맑은 고딕"/>
+                <w:color w:val="6E6E6E"/>
+                <w:vertAlign w:val="subscript"/>
+                <w:sz w:val="16"/>
+                <w:szCs w:val="16"/>
+                <w:lang w:eastAsia="ko-KR"/>
+              </w:rPr>
+              <w:t xml:space="preserve">ij</w:t>
+            </w:r>
+            <w:r>
+              <w:rPr>
+                <w:rFonts w:ascii="맑은 고딕" w:hAnsi="맑은 고딕" w:cs="맑은 고딕"/>
+                <w:color w:val="6E6E6E"/>
+                <w:sz w:val="16"/>
+                <w:szCs w:val="16"/>
+                <w:lang w:eastAsia="ko-KR"/>
+              </w:rPr>
+              <w:t xml:space="preserve"> : 아크 (i,j)의 단위 수송비 (deterministic)</w:t>
+            </w:r>
+          </w:p>
+          <w:p>
+            <w:pPr>
+              <w:spacing w:before="20" w:after="20" w:line="240" w:lineRule="auto"/>
+              <w:rPr>
+                <w:lang w:eastAsia="ko-KR"/>
+              </w:rPr>
+            </w:pPr>
+            <w:r>
+              <w:rPr>
+                <w:rFonts w:ascii="맑은 고딕" w:hAnsi="맑은 고딕" w:cs="맑은 고딕"/>
+                <w:color w:val="6E6E6E"/>
+                <w:sz w:val="16"/>
+                <w:szCs w:val="16"/>
+                <w:lang w:eastAsia="ko-KR"/>
+              </w:rPr>
+              <w:t xml:space="preserve">f</w:t>
+            </w:r>
+            <w:r>
+              <w:rPr>
+                <w:rFonts w:ascii="맑은 고딕" w:hAnsi="맑은 고딕" w:cs="맑은 고딕"/>
+                <w:color w:val="6E6E6E"/>
+                <w:vertAlign w:val="subscript"/>
+                <w:sz w:val="16"/>
+                <w:szCs w:val="16"/>
+                <w:lang w:eastAsia="ko-KR"/>
+              </w:rPr>
+              <w:t xml:space="preserve">i</w:t>
+            </w:r>
+            <w:r>
+              <w:rPr>
+                <w:rFonts w:ascii="맑은 고딕" w:hAnsi="맑은 고딕" w:cs="맑은 고딕"/>
+                <w:color w:val="6E6E6E"/>
+                <w:sz w:val="16"/>
+                <w:szCs w:val="16"/>
+                <w:lang w:eastAsia="ko-KR"/>
+              </w:rPr>
+              <w:t xml:space="preserve"> : 노드 i의 시설 개설비 (deterministic)</w:t>
+            </w:r>
+          </w:p>
+          <w:p>
+            <w:pPr>
+              <w:spacing w:before="20" w:after="20" w:line="240" w:lineRule="auto"/>
+              <w:rPr>
+                <w:lang w:eastAsia="ko-KR"/>
+              </w:rPr>
+            </w:pPr>
+            <w:r>
+              <w:rPr>
+                <w:rFonts w:ascii="맑은 고딕" w:hAnsi="맑은 고딕" w:cs="맑은 고딕"/>
+                <w:color w:val="6E6E6E"/>
+                <w:sz w:val="16"/>
+                <w:szCs w:val="16"/>
+                <w:lang w:eastAsia="ko-KR"/>
+              </w:rPr>
+              <w:t xml:space="preserve">h</w:t>
+            </w:r>
+            <w:r>
+              <w:rPr>
+                <w:rFonts w:ascii="맑은 고딕" w:hAnsi="맑은 고딕" w:cs="맑은 고딕"/>
+                <w:color w:val="6E6E6E"/>
+                <w:vertAlign w:val="subscript"/>
+                <w:sz w:val="16"/>
+                <w:szCs w:val="16"/>
+                <w:lang w:eastAsia="ko-KR"/>
+              </w:rPr>
+              <w:t xml:space="preserve">i</w:t>
+            </w:r>
+            <w:r>
+              <w:rPr>
+                <w:rFonts w:ascii="맑은 고딕" w:hAnsi="맑은 고딕" w:cs="맑은 고딕"/>
+                <w:color w:val="6E6E6E"/>
+                <w:sz w:val="16"/>
+                <w:szCs w:val="16"/>
+                <w:lang w:eastAsia="ko-KR"/>
+              </w:rPr>
+              <w:t xml:space="preserve"> : 단위 재고 구매비 (deterministic)</w:t>
+            </w:r>
+          </w:p>
+          <w:p>
+            <w:pPr>
+              <w:spacing w:before="20" w:after="20" w:line="240" w:lineRule="auto"/>
+              <w:rPr>
+                <w:lang w:eastAsia="ko-KR"/>
+              </w:rPr>
+            </w:pPr>
+            <w:r>
+              <w:rPr>
+                <w:rFonts w:ascii="맑은 고딕" w:hAnsi="맑은 고딕" w:cs="맑은 고딕"/>
+                <w:color w:val="6E6E6E"/>
+                <w:sz w:val="16"/>
+                <w:szCs w:val="16"/>
+                <w:lang w:eastAsia="ko-KR"/>
+              </w:rPr>
+              <w:t xml:space="preserve">u</w:t>
+            </w:r>
+            <w:r>
+              <w:rPr>
+                <w:rFonts w:ascii="맑은 고딕" w:hAnsi="맑은 고딕" w:cs="맑은 고딕"/>
+                <w:color w:val="6E6E6E"/>
+                <w:vertAlign w:val="subscript"/>
+                <w:sz w:val="16"/>
+                <w:szCs w:val="16"/>
+                <w:lang w:eastAsia="ko-KR"/>
+              </w:rPr>
+              <w:t xml:space="preserve">i</w:t>
+            </w:r>
+            <w:r>
+              <w:rPr>
+                <w:rFonts w:ascii="맑은 고딕" w:hAnsi="맑은 고딕" w:cs="맑은 고딕"/>
+                <w:color w:val="6E6E6E"/>
+                <w:sz w:val="16"/>
+                <w:szCs w:val="16"/>
+                <w:lang w:eastAsia="ko-KR"/>
+              </w:rPr>
+              <w:t xml:space="preserve"> : 단위 미충족 재고 패널티 비용 (deterministic)</w:t>
+            </w:r>
+          </w:p>
+          <w:p>
+            <w:pPr>
+              <w:spacing w:before="20" w:after="20" w:line="240" w:lineRule="auto"/>
+              <w:rPr>
+                <w:lang w:eastAsia="ko-KR"/>
+              </w:rPr>
+            </w:pPr>
+            <w:r>
+              <w:rPr>
+                <w:rFonts w:ascii="맑은 고딕" w:hAnsi="맑은 고딕" w:cs="맑은 고딕"/>
+                <w:color w:val="6E6E6E"/>
+                <w:sz w:val="16"/>
+                <w:szCs w:val="16"/>
+                <w:lang w:eastAsia="ko-KR"/>
+              </w:rPr>
+              <w:t xml:space="preserve">o</w:t>
+            </w:r>
+            <w:r>
+              <w:rPr>
+                <w:rFonts w:ascii="맑은 고딕" w:hAnsi="맑은 고딕" w:cs="맑은 고딕"/>
+                <w:color w:val="6E6E6E"/>
+                <w:vertAlign w:val="subscript"/>
+                <w:sz w:val="16"/>
+                <w:szCs w:val="16"/>
+                <w:lang w:eastAsia="ko-KR"/>
+              </w:rPr>
+              <w:t xml:space="preserve">i</w:t>
+            </w:r>
+            <w:r>
+              <w:rPr>
+                <w:rFonts w:ascii="맑은 고딕" w:hAnsi="맑은 고딕" w:cs="맑은 고딕"/>
+                <w:color w:val="6E6E6E"/>
+                <w:sz w:val="16"/>
+                <w:szCs w:val="16"/>
+                <w:lang w:eastAsia="ko-KR"/>
+              </w:rPr>
+              <w:t xml:space="preserve"> : 단위 잉여 재고 관리 비용 (deterministic)</w:t>
+            </w:r>
+          </w:p>
+          <w:p>
+            <w:pPr>
+              <w:spacing w:before="20" w:after="20" w:line="240" w:lineRule="auto"/>
+              <w:rPr>
+                <w:lang w:eastAsia="ko-KR"/>
+              </w:rPr>
+            </w:pPr>
+            <w:r>
+              <w:rPr>
+                <w:rFonts w:ascii="맑은 고딕" w:hAnsi="맑은 고딕" w:cs="맑은 고딕"/>
+                <w:color w:val="6E6E6E"/>
+                <w:sz w:val="16"/>
+                <w:szCs w:val="16"/>
+                <w:lang w:eastAsia="ko-KR"/>
+              </w:rPr>
+              <w:t xml:space="preserve">B : 총 가용 재고 (deterministic)</w:t>
+            </w:r>
+          </w:p>
+          <w:p>
+            <w:pPr>
+              <w:spacing w:before="20" w:after="20" w:line="240" w:lineRule="auto"/>
+              <w:rPr>
+                <w:lang w:eastAsia="ko-KR"/>
+              </w:rPr>
+            </w:pPr>
+            <w:r>
+              <w:rPr>
+                <w:rFonts w:ascii="맑은 고딕" w:hAnsi="맑은 고딕" w:cs="맑은 고딕"/>
+                <w:color w:val="6E6E6E"/>
+                <w:sz w:val="16"/>
+                <w:szCs w:val="16"/>
+                <w:lang w:eastAsia="ko-KR"/>
+              </w:rPr>
+              <w:t xml:space="preserve">p : 최대 개설 시설 수 (deterministic)</w:t>
+            </w:r>
+          </w:p>
+        </w:tc>
+      </w:tr>
+    </w:tbl>
+    <w:p>
+      <w:pPr>
+        <w:keepNext/>
+        <w:spacing w:before="100" w:after="20" w:line="240" w:lineRule="auto"/>
+        <w:rPr>
+          <w:lang w:eastAsia="ko-KR"/>
+        </w:rPr>
+      </w:pPr>
+      <w:r>
+        <w:rPr>
+          <w:rFonts w:ascii="맑은 고딕" w:hAnsi="맑은 고딕" w:cs="맑은 고딕"/>
+          <w:b/>
+          <w:szCs w:val="20"/>
+          <w:lang w:eastAsia="ko-KR"/>
+        </w:rPr>
+        <w:t xml:space="preserve">수식화</w:t>
+      </w:r>
+    </w:p>
+    <w:p>
+      <w:pPr>
+        <w:keepNext/>
+        <w:spacing w:after="60" w:line="240" w:lineRule="auto"/>
+        <w:rPr>
+          <w:lang w:eastAsia="ko-KR"/>
+        </w:rPr>
+      </w:pPr>
+      <w:r>
+        <w:rPr>
+          <w:rFonts w:ascii="맑은 고딕" w:hAnsi="맑은 고딕" w:cs="맑은 고딕"/>
+          <w:color w:val="6E6E6E"/>
+          <w:sz w:val="18"/>
+          <w:szCs w:val="18"/>
+          <w:lang w:eastAsia="ko-KR"/>
+        </w:rPr>
+        <w:t xml:space="preserve">위 기호로 objective function과 constraints를 수식으로 쓰세요. Minimize / Maximize 중 하나를 고르고, 그 아래에 decision variables를 모두 적습니다(중간고사와 같은 규칙).</w:t>
+      </w:r>
+    </w:p>
+    <w:tbl>
+      <w:tblPr>
+        <w:tblW w:w="9412" w:type="dxa"/>
+        <w:jc w:val="center"/>
+        <w:tblBorders>
+          <w:top w:val="nil"/>
+          <w:left w:val="nil"/>
+          <w:bottom w:val="nil"/>
+          <w:right w:val="nil"/>
+          <w:insideH w:val="nil"/>
+          <w:insideV w:val="nil"/>
+        </w:tblBorders>
+        <w:tblLayout w:type="fixed"/>
+        <w:tblLook w:val="0000" w:firstRow="0" w:lastRow="0" w:firstColumn="0" w:lastColumn="0" w:noHBand="1" w:noVBand="1"/>
+      </w:tblPr>
+      <w:tblGrid>
+        <w:gridCol w:w="2600"/>
+        <w:gridCol w:w="6812"/>
+      </w:tblGrid>
+      <w:tr>
+        <w:trPr>
+          <w:cantSplit/>
+          <w:trHeight w:val="520" w:hRule="atLeast"/>
+          <w:jc w:val="center"/>
+        </w:trPr>
+        <w:tc>
+          <w:tcPr>
+            <w:tcW w:w="2600" w:type="dxa"/>
+            <w:vAlign w:val="bottom"/>
+          </w:tcPr>
+          <w:p>
+            <w:pPr>
+              <w:spacing w:before="0" w:after="0" w:line="240" w:lineRule="auto"/>
+              <w:rPr>
+                <w:lang w:eastAsia="ko-KR"/>
+              </w:rPr>
+            </w:pPr>
+            <w:r>
+              <w:rPr>
+                <w:rFonts w:ascii="맑은 고딕" w:hAnsi="맑은 고딕" w:cs="맑은 고딕"/>
+                <w:szCs w:val="20"/>
+                <w:lang w:eastAsia="ko-KR"/>
+              </w:rPr>
+              <w:t xml:space="preserve">Minimize / Maximize</w:t>
+            </w:r>
+          </w:p>
+        </w:tc>
+        <w:tc>
+          <w:tcPr>
+            <w:tcW w:w="6812" w:type="dxa"/>
+            <w:tcBorders>
+              <w:bottom w:val="single" w:sz="4" w:space="0" w:color="BBBBBB"/>
+            </w:tcBorders>
+            <w:vAlign w:val="bottom"/>
+          </w:tcPr>
+          <w:p>
+            <w:pPr>
+              <w:spacing w:before="0" w:after="0" w:line="240" w:lineRule="auto"/>
+              <w:rPr>
+                <w:lang w:eastAsia="ko-KR"/>
+              </w:rPr>
+            </w:pPr>
+          </w:p>
+        </w:tc>
+      </w:tr>
+      <w:tr>
+        <w:trPr>
+          <w:cantSplit/>
+          <w:trHeight w:val="360" w:hRule="atLeast"/>
+          <w:jc w:val="center"/>
+        </w:trPr>
+        <w:tc>
+          <w:tcPr>
+            <w:tcW w:w="2600" w:type="dxa"/>
+            <w:tcBorders>
+              <w:bottom w:val="single" w:sz="4" w:space="0" w:color="BBBBBB"/>
+            </w:tcBorders>
+            <w:vAlign w:val="bottom"/>
+          </w:tcPr>
+          <w:p>
+            <w:pPr>
+              <w:spacing w:before="0" w:after="0" w:line="240" w:lineRule="auto"/>
+              <w:rPr>
+                <w:lang w:eastAsia="ko-KR"/>
+              </w:rPr>
+            </w:pPr>
+          </w:p>
+        </w:tc>
+        <w:tc>
+          <w:tcPr>
+            <w:tcW w:w="6812" w:type="dxa"/>
+            <w:vAlign w:val="bottom"/>
+          </w:tcPr>
+          <w:p>
+            <w:pPr>
+              <w:spacing w:before="0" w:after="0" w:line="240" w:lineRule="auto"/>
+              <w:rPr>
+                <w:lang w:eastAsia="ko-KR"/>
+              </w:rPr>
+            </w:pPr>
+          </w:p>
+        </w:tc>
+      </w:tr>
+      <w:tr>
+        <w:trPr>
+          <w:cantSplit/>
+          <w:trHeight w:val="520" w:hRule="atLeast"/>
+          <w:jc w:val="center"/>
+        </w:trPr>
+        <w:tc>
+          <w:tcPr>
+            <w:tcW w:w="2600" w:type="dxa"/>
+            <w:vAlign w:val="bottom"/>
+          </w:tcPr>
+          <w:p>
+            <w:pPr>
+              <w:spacing w:before="0" w:after="0" w:line="240" w:lineRule="auto"/>
+              <w:rPr>
+                <w:lang w:eastAsia="ko-KR"/>
+              </w:rPr>
+            </w:pPr>
+            <w:r>
+              <w:rPr>
+                <w:rFonts w:ascii="맑은 고딕" w:hAnsi="맑은 고딕" w:cs="맑은 고딕"/>
+                <w:szCs w:val="20"/>
+                <w:lang w:eastAsia="ko-KR"/>
+              </w:rPr>
+              <w:t xml:space="preserve">s.t.</w:t>
+            </w:r>
+          </w:p>
+        </w:tc>
+        <w:tc>
+          <w:tcPr>
+            <w:tcW w:w="6812" w:type="dxa"/>
+            <w:tcBorders>
+              <w:bottom w:val="single" w:sz="4" w:space="0" w:color="BBBBBB"/>
+            </w:tcBorders>
+            <w:vAlign w:val="bottom"/>
+          </w:tcPr>
+          <w:p>
+            <w:pPr>
+              <w:spacing w:before="0" w:after="0" w:line="240" w:lineRule="auto"/>
+              <w:rPr>
+                <w:lang w:eastAsia="ko-KR"/>
+              </w:rPr>
+            </w:pPr>
+          </w:p>
+        </w:tc>
+      </w:tr>
+      <w:tr>
+        <w:trPr>
+          <w:cantSplit/>
+          <w:trHeight w:val="520" w:hRule="atLeast"/>
+          <w:jc w:val="center"/>
+        </w:trPr>
+        <w:tc>
+          <w:tcPr>
+            <w:tcW w:w="2600" w:type="dxa"/>
+            <w:vAlign w:val="bottom"/>
+          </w:tcPr>
+          <w:p>
+            <w:pPr>
+              <w:spacing w:before="0" w:after="0" w:line="240" w:lineRule="auto"/>
+              <w:rPr>
+                <w:lang w:eastAsia="ko-KR"/>
+              </w:rPr>
+            </w:pPr>
+          </w:p>
+        </w:tc>
+        <w:tc>
+          <w:tcPr>
+            <w:tcW w:w="6812" w:type="dxa"/>
+            <w:tcBorders>
+              <w:bottom w:val="single" w:sz="4" w:space="0" w:color="BBBBBB"/>
+            </w:tcBorders>
+            <w:vAlign w:val="bottom"/>
+          </w:tcPr>
+          <w:p>
+            <w:pPr>
+              <w:spacing w:before="0" w:after="0" w:line="240" w:lineRule="auto"/>
+              <w:rPr>
+                <w:lang w:eastAsia="ko-KR"/>
+              </w:rPr>
+            </w:pPr>
+          </w:p>
+        </w:tc>
+      </w:tr>
+      <w:tr>
+        <w:trPr>
+          <w:cantSplit/>
+          <w:trHeight w:val="520" w:hRule="atLeast"/>
+          <w:jc w:val="center"/>
+        </w:trPr>
+        <w:tc>
+          <w:tcPr>
+            <w:tcW w:w="2600" w:type="dxa"/>
+            <w:vAlign w:val="bottom"/>
+          </w:tcPr>
+          <w:p>
+            <w:pPr>
+              <w:spacing w:before="0" w:after="0" w:line="240" w:lineRule="auto"/>
+              <w:rPr>
+                <w:lang w:eastAsia="ko-KR"/>
+              </w:rPr>
+            </w:pPr>
+          </w:p>
+        </w:tc>
+        <w:tc>
+          <w:tcPr>
+            <w:tcW w:w="6812" w:type="dxa"/>
+            <w:tcBorders>
+              <w:bottom w:val="single" w:sz="4" w:space="0" w:color="BBBBBB"/>
+            </w:tcBorders>
+            <w:vAlign w:val="bottom"/>
+          </w:tcPr>
+          <w:p>
+            <w:pPr>
+              <w:spacing w:before="0" w:after="0" w:line="240" w:lineRule="auto"/>
+              <w:rPr>
+                <w:lang w:eastAsia="ko-KR"/>
+              </w:rPr>
+            </w:pPr>
+          </w:p>
+        </w:tc>
+      </w:tr>
+      <w:tr>
+        <w:trPr>
+          <w:cantSplit/>
+          <w:trHeight w:val="520" w:hRule="atLeast"/>
+          <w:jc w:val="center"/>
+        </w:trPr>
+        <w:tc>
+          <w:tcPr>
+            <w:tcW w:w="2600" w:type="dxa"/>
+            <w:vAlign w:val="bottom"/>
+          </w:tcPr>
+          <w:p>
+            <w:pPr>
+              <w:spacing w:before="0" w:after="0" w:line="240" w:lineRule="auto"/>
+              <w:rPr>
+                <w:lang w:eastAsia="ko-KR"/>
+              </w:rPr>
+            </w:pPr>
+          </w:p>
+        </w:tc>
+        <w:tc>
+          <w:tcPr>
+            <w:tcW w:w="6812" w:type="dxa"/>
+            <w:tcBorders>
+              <w:bottom w:val="single" w:sz="4" w:space="0" w:color="BBBBBB"/>
+            </w:tcBorders>
+            <w:vAlign w:val="bottom"/>
+          </w:tcPr>
+          <w:p>
+            <w:pPr>
+              <w:spacing w:before="0" w:after="0" w:line="240" w:lineRule="auto"/>
+              <w:rPr>
+                <w:lang w:eastAsia="ko-KR"/>
+              </w:rPr>
+            </w:pPr>
+          </w:p>
+        </w:tc>
+      </w:tr>
+      <w:tr>
+        <w:trPr>
+          <w:cantSplit/>
+          <w:trHeight w:val="520" w:hRule="atLeast"/>
+          <w:jc w:val="center"/>
+        </w:trPr>
+        <w:tc>
+          <w:tcPr>
+            <w:tcW w:w="2600" w:type="dxa"/>
+            <w:vAlign w:val="bottom"/>
+          </w:tcPr>
+          <w:p>
+            <w:pPr>
+              <w:spacing w:before="0" w:after="0" w:line="240" w:lineRule="auto"/>
+              <w:rPr>
+                <w:lang w:eastAsia="ko-KR"/>
+              </w:rPr>
+            </w:pPr>
+          </w:p>
+        </w:tc>
+        <w:tc>
+          <w:tcPr>
+            <w:tcW w:w="6812" w:type="dxa"/>
+            <w:tcBorders>
+              <w:bottom w:val="single" w:sz="4" w:space="0" w:color="BBBBBB"/>
+            </w:tcBorders>
+            <w:vAlign w:val="bottom"/>
+          </w:tcPr>
+          <w:p>
+            <w:pPr>
+              <w:spacing w:before="0" w:after="0" w:line="240" w:lineRule="auto"/>
+              <w:rPr>
+                <w:lang w:eastAsia="ko-KR"/>
+              </w:rPr>
+            </w:pPr>
+          </w:p>
+        </w:tc>
+      </w:tr>
+      <w:tr>
+        <w:trPr>
+          <w:cantSplit/>
+          <w:trHeight w:val="520" w:hRule="atLeast"/>
+          <w:jc w:val="center"/>
+        </w:trPr>
+        <w:tc>
+          <w:tcPr>
+            <w:tcW w:w="2600" w:type="dxa"/>
+            <w:vAlign w:val="bottom"/>
+          </w:tcPr>
+          <w:p>
+            <w:pPr>
+              <w:spacing w:before="0" w:after="0" w:line="240" w:lineRule="auto"/>
+              <w:rPr>
+                <w:lang w:eastAsia="ko-KR"/>
+              </w:rPr>
+            </w:pPr>
+          </w:p>
+        </w:tc>
+        <w:tc>
+          <w:tcPr>
+            <w:tcW w:w="6812" w:type="dxa"/>
+            <w:tcBorders>
+              <w:bottom w:val="single" w:sz="4" w:space="0" w:color="BBBBBB"/>
+            </w:tcBorders>
+            <w:vAlign w:val="bottom"/>
+          </w:tcPr>
+          <w:p>
+            <w:pPr>
+              <w:spacing w:before="0" w:after="0" w:line="240" w:lineRule="auto"/>
+              <w:rPr>
+                <w:lang w:eastAsia="ko-KR"/>
+              </w:rPr>
+            </w:pPr>
+          </w:p>
+        </w:tc>
+      </w:tr>
+      <w:tr>
+        <w:trPr>
+          <w:cantSplit/>
+          <w:trHeight w:val="520" w:hRule="atLeast"/>
+          <w:jc w:val="center"/>
+        </w:trPr>
+        <w:tc>
+          <w:tcPr>
+            <w:tcW w:w="2600" w:type="dxa"/>
+            <w:vAlign w:val="bottom"/>
+          </w:tcPr>
+          <w:p>
+            <w:pPr>
+              <w:spacing w:before="0" w:after="0" w:line="240" w:lineRule="auto"/>
+              <w:rPr>
+                <w:lang w:eastAsia="ko-KR"/>
+              </w:rPr>
+            </w:pPr>
+          </w:p>
+        </w:tc>
+        <w:tc>
+          <w:tcPr>
+            <w:tcW w:w="6812" w:type="dxa"/>
+            <w:tcBorders>
+              <w:bottom w:val="single" w:sz="4" w:space="0" w:color="BBBBBB"/>
+            </w:tcBorders>
+            <w:vAlign w:val="bottom"/>
+          </w:tcPr>
+          <w:p>
+            <w:pPr>
+              <w:spacing w:before="0" w:after="0" w:line="240" w:lineRule="auto"/>
+              <w:rPr>
+                <w:lang w:eastAsia="ko-KR"/>
+              </w:rPr>
+            </w:pPr>
+          </w:p>
+        </w:tc>
+      </w:tr>
+      <w:tr>
+        <w:trPr>
+          <w:cantSplit/>
+          <w:trHeight w:val="520" w:hRule="atLeast"/>
+          <w:jc w:val="center"/>
+        </w:trPr>
+        <w:tc>
+          <w:tcPr>
+            <w:tcW w:w="2600" w:type="dxa"/>
+            <w:vAlign w:val="bottom"/>
+          </w:tcPr>
+          <w:p>
+            <w:pPr>
+              <w:spacing w:before="0" w:after="0" w:line="240" w:lineRule="auto"/>
+              <w:rPr>
+                <w:lang w:eastAsia="ko-KR"/>
+              </w:rPr>
+            </w:pPr>
+          </w:p>
+        </w:tc>
+        <w:tc>
+          <w:tcPr>
+            <w:tcW w:w="6812" w:type="dxa"/>
+            <w:tcBorders>
+              <w:bottom w:val="single" w:sz="4" w:space="0" w:color="BBBBBB"/>
+            </w:tcBorders>
+            <w:vAlign w:val="bottom"/>
+          </w:tcPr>
+          <w:p>
+            <w:pPr>
+              <w:spacing w:before="0" w:after="0" w:line="240" w:lineRule="auto"/>
+              <w:rPr>
+                <w:lang w:eastAsia="ko-KR"/>
+              </w:rPr>
+            </w:pPr>
+          </w:p>
+        </w:tc>
+      </w:tr>
+      <w:tr>
+        <w:trPr>
+          <w:cantSplit/>
+          <w:trHeight w:val="520" w:hRule="atLeast"/>
+          <w:jc w:val="center"/>
+        </w:trPr>
+        <w:tc>
+          <w:tcPr>
+            <w:tcW w:w="2600" w:type="dxa"/>
+            <w:vAlign w:val="bottom"/>
+          </w:tcPr>
+          <w:p>
+            <w:pPr>
+              <w:spacing w:before="0" w:after="0" w:line="240" w:lineRule="auto"/>
+              <w:rPr>
+                <w:lang w:eastAsia="ko-KR"/>
+              </w:rPr>
+            </w:pPr>
+          </w:p>
+        </w:tc>
+        <w:tc>
+          <w:tcPr>
+            <w:tcW w:w="6812" w:type="dxa"/>
+            <w:tcBorders>
+              <w:bottom w:val="single" w:sz="4" w:space="0" w:color="BBBBBB"/>
+            </w:tcBorders>
+            <w:vAlign w:val="bottom"/>
+          </w:tcPr>
+          <w:p>
+            <w:pPr>
+              <w:spacing w:before="0" w:after="0" w:line="240" w:lineRule="auto"/>
+              <w:rPr>
+                <w:lang w:eastAsia="ko-KR"/>
+              </w:rPr>
+            </w:pPr>
+          </w:p>
+        </w:tc>
+      </w:tr>
+      <w:tr>
+        <w:trPr>
+          <w:cantSplit/>
+          <w:trHeight w:val="520" w:hRule="atLeast"/>
+          <w:jc w:val="center"/>
+        </w:trPr>
+        <w:tc>
+          <w:tcPr>
+            <w:tcW w:w="2600" w:type="dxa"/>
+            <w:vAlign w:val="bottom"/>
+          </w:tcPr>
+          <w:p>
+            <w:pPr>
+              <w:spacing w:before="0" w:after="0" w:line="240" w:lineRule="auto"/>
+              <w:rPr>
+                <w:lang w:eastAsia="ko-KR"/>
+              </w:rPr>
+            </w:pPr>
+          </w:p>
+        </w:tc>
+        <w:tc>
+          <w:tcPr>
+            <w:tcW w:w="6812" w:type="dxa"/>
+            <w:tcBorders>
+              <w:bottom w:val="single" w:sz="4" w:space="0" w:color="BBBBBB"/>
+            </w:tcBorders>
+            <w:vAlign w:val="bottom"/>
+          </w:tcPr>
+          <w:p>
+            <w:pPr>
+              <w:spacing w:before="0" w:after="0" w:line="240" w:lineRule="auto"/>
+              <w:rPr>
+                <w:lang w:eastAsia="ko-KR"/>
+              </w:rPr>
+            </w:pPr>
+          </w:p>
+        </w:tc>
+      </w:tr>
+      <w:tr>
+        <w:trPr>
+          <w:cantSplit/>
+          <w:trHeight w:val="520" w:hRule="atLeast"/>
+          <w:jc w:val="center"/>
+        </w:trPr>
+        <w:tc>
+          <w:tcPr>
+            <w:tcW w:w="2600" w:type="dxa"/>
+            <w:vAlign w:val="bottom"/>
+          </w:tcPr>
+          <w:p>
+            <w:pPr>
+              <w:spacing w:before="0" w:after="0" w:line="240" w:lineRule="auto"/>
+              <w:rPr>
+                <w:lang w:eastAsia="ko-KR"/>
+              </w:rPr>
+            </w:pPr>
+          </w:p>
+        </w:tc>
+        <w:tc>
+          <w:tcPr>
+            <w:tcW w:w="6812" w:type="dxa"/>
+            <w:tcBorders>
+              <w:bottom w:val="single" w:sz="4" w:space="0" w:color="BBBBBB"/>
+            </w:tcBorders>
+            <w:vAlign w:val="bottom"/>
+          </w:tcPr>
+          <w:p>
+            <w:pPr>
+              <w:spacing w:before="0" w:after="0" w:line="240" w:lineRule="auto"/>
+              <w:rPr>
+                <w:lang w:eastAsia="ko-KR"/>
+              </w:rPr>
+            </w:pPr>
+          </w:p>
+        </w:tc>
+      </w:tr>
+    </w:tbl>
+    <w:p>
+      <w:pPr>
+        <w:pageBreakBefore/>
+        <w:keepNext/>
+        <w:pBdr>
+          <w:top w:val="single" w:sz="8" w:space="4" w:color="12448C"/>
+        </w:pBdr>
+        <w:tabs>
+          <w:tab w:val="right" w:pos="9412"/>
+        </w:tabs>
+        <w:spacing w:before="160" w:line="240" w:lineRule="auto"/>
+        <w:rPr>
+          <w:lang w:eastAsia="ko-KR"/>
+        </w:rPr>
+      </w:pPr>
+      <w:r>
+        <w:rPr>
+          <w:rFonts w:ascii="맑은 고딕" w:hAnsi="맑은 고딕" w:cs="맑은 고딕"/>
+          <w:b/>
+          <w:sz w:val="22"/>
+          <w:lang w:eastAsia="ko-KR"/>
+        </w:rPr>
         <w:lastRenderedPageBreak/>
-        <w:t>3.  불확실성</w:t>
+        <w:t>4.  불확실성</w:t>
+      </w:r>
+      <w:r>
+        <w:rPr>
+          <w:rFonts w:ascii="맑은 고딕" w:hAnsi="맑은 고딕" w:cs="맑은 고딕"/>
+          <w:b/>
+          <w:color w:val="C00000"/>
+          <w:sz w:val="22"/>
+          <w:lang w:eastAsia="ko-KR"/>
+        </w:rPr>
+        <w:t xml:space="preserve"> (선택)</w:t>
+      </w:r>
+    </w:p>
+    <w:p>
+      <w:pPr>
+        <w:keepNext/>
+        <w:spacing w:before="60" w:after="40" w:line="240" w:lineRule="auto"/>
+        <w:rPr>
+          <w:lang w:eastAsia="ko-KR"/>
+        </w:rPr>
+      </w:pPr>
+      <w:r>
+        <w:rPr>
+          <w:rFonts w:ascii="맑은 고딕" w:hAnsi="맑은 고딕" w:cs="맑은 고딕"/>
+          <w:b/>
+          <w:color w:val="C00000"/>
+          <w:sz w:val="18"/>
+          <w:szCs w:val="18"/>
+          <w:lang w:eastAsia="ko-KR"/>
+        </w:rPr>
+        <w:t>※ 이 항목은 필수가 아닙니다. 문제 자체가 불확실성을 고려해야 하는 상황일 때만 작성하세요.</w:t>
       </w:r>
     </w:p>
     <w:p>
@@ -859,7 +2343,7 @@
           <w:szCs w:val="18"/>
           <w:lang w:eastAsia="ko-KR"/>
         </w:rPr>
-        <w:t>과거 자료(표본)가 있나요, 몇 개의 시나리오로 나눌 수 있나요, 범위(최소~최대)만 아나요?</w:t>
+        <w:t xml:space="preserve">과거 자료(sample)가 있나요, 몇 개의 scenario로 나눌 수 있나요, 범위(최소~최대)만 아나요?</w:t>
       </w:r>
     </w:p>
     <w:tbl>
@@ -940,7 +2424,7 @@
           <w:szCs w:val="18"/>
           <w:lang w:eastAsia="ko-KR"/>
         </w:rPr>
-        <w:t xml:space="preserve">평균값 하나로 대체해 결정론적 문제를 풀면 무슨 일이 생기나요? (예: 수요가 평균보다 크면 부족, 작으면 낭비) </w:t>
+        <w:t xml:space="preserve">평균값 하나로 대체해 deterministic 문제를 풀면 무슨 일이 생기나요? (예: 수요가 평균보다 크면 부족, 작으면 낭비)</w:t>
       </w:r>
     </w:p>
     <w:tbl>
@@ -1005,7 +2489,7 @@
           <w:sz w:val="22"/>
           <w:lang w:eastAsia="ko-KR"/>
         </w:rPr>
-        <w:t>4.  관련 연구</w:t>
+        <w:t>5.  관련 연구</w:t>
       </w:r>
       <w:r>
         <w:tab/>
@@ -1034,49 +2518,7 @@
           <w:szCs w:val="18"/>
           <w:lang w:eastAsia="ko-KR"/>
         </w:rPr>
-        <w:t xml:space="preserve">비슷한 문제를 다룬 논문·보고서를 찾아보세요. 검색: Google Scholar, RISS, </w:t>
-      </w:r>
-      <w:proofErr w:type="spellStart"/>
-      <w:r>
-        <w:rPr>
-          <w:rFonts w:ascii="맑은 고딕" w:hAnsi="맑은 고딕" w:cs="맑은 고딕"/>
-          <w:color w:val="6E6E6E"/>
-          <w:sz w:val="18"/>
-          <w:szCs w:val="18"/>
-          <w:lang w:eastAsia="ko-KR"/>
-        </w:rPr>
-        <w:t>DBpia</w:t>
-      </w:r>
-      <w:proofErr w:type="spellEnd"/>
-      <w:r>
-        <w:rPr>
-          <w:rFonts w:ascii="맑은 고딕" w:hAnsi="맑은 고딕" w:cs="맑은 고딕"/>
-          <w:color w:val="6E6E6E"/>
-          <w:sz w:val="18"/>
-          <w:szCs w:val="18"/>
-          <w:lang w:eastAsia="ko-KR"/>
-        </w:rPr>
-        <w:t>, DTIC(미 국방 기술보고서), 한국국방경영분석학회지. 키워드 예: (문제 이름) +</w:t>
-      </w:r>
-      <w:r>
-        <w:rPr>
-          <w:rFonts w:ascii="맑은 고딕" w:hAnsi="맑은 고딕" w:cs="맑은 고딕" w:hint="eastAsia"/>
-          <w:color w:val="6E6E6E"/>
-          <w:sz w:val="18"/>
-          <w:szCs w:val="18"/>
-          <w:lang w:eastAsia="ko-KR"/>
-        </w:rPr>
-        <w:t xml:space="preserve"> mixed integer linear programming /</w:t>
-      </w:r>
-      <w:r>
-        <w:rPr>
-          <w:rFonts w:ascii="맑은 고딕" w:hAnsi="맑은 고딕" w:cs="맑은 고딕"/>
-          <w:color w:val="6E6E6E"/>
-          <w:sz w:val="18"/>
-          <w:szCs w:val="18"/>
-          <w:lang w:eastAsia="ko-KR"/>
-        </w:rPr>
-        <w:t xml:space="preserve"> stochastic programming / two-stage. 그들은 불확실성을 어떻게 다뤘고, 우리 아이디어는 무엇이 다른가요?</w:t>
+        <w:t xml:space="preserve">비슷한 문제를 다룬 논문·보고서를 찾아보세요. 검색: Google Scholar, RISS, DBpia, DTIC(미 국방 기술보고서), 한국국방경영분석학회지. 키워드 예: (문제 이름) + integer programming / mixed integer linear programming / facility location / location–allocation 등. 그들은 어떤 decision variables와 constraints로 formulation했고 어떻게 풀었나요(commercial solver, branch-and-bound, heuristic 등)? 우리 아이디어는 무엇이 다른가요?</w:t>
       </w:r>
     </w:p>
     <w:tbl>
@@ -1411,7 +2853,7 @@
           <w:sz w:val="22"/>
           <w:lang w:eastAsia="ko-KR"/>
         </w:rPr>
-        <w:t>5.  한 문장 피칭</w:t>
+        <w:t>6.  한 문장 피칭</w:t>
       </w:r>
       <w:r>
         <w:rPr>
@@ -1446,7 +2888,7 @@
           <w:szCs w:val="18"/>
           <w:lang w:eastAsia="ko-KR"/>
         </w:rPr>
-        <w:t>예: 탄약 소요가 불확실한 상황에서, 전방 보급소의 사전 비축량을 결정하여, 부족·과잉 비용의 기대값을 최소화한다.</w:t>
+        <w:t xml:space="preserve">예: 각 부대의 탄약 소요를 충족하면서, 전방 보급소 후보지 중 어디를 개설하고 각 부대를 어느 보급소에 배정할지 결정하여, 개설 고정비와 수송비의 합을 최소화한다. (불확실성을 다룬다면 맨 앞에 “…이(가) 불확실한 상황에서,”를 덧붙이세요.)</w:t>
       </w:r>
     </w:p>
     <w:tbl>
@@ -1487,7 +2929,7 @@
                 <w:szCs w:val="20"/>
                 <w:lang w:eastAsia="ko-KR"/>
               </w:rPr>
-              <w:t>______________________________  이(가) 불확실한 상황에서,</w:t>
+              <w:t xml:space="preserve">______________________________  을(를) 지키면서,</w:t>
             </w:r>
           </w:p>
           <w:p>
@@ -1559,7 +3001,7 @@
           <w:szCs w:val="18"/>
           <w:lang w:eastAsia="ko-KR"/>
         </w:rPr>
-        <w:t>데이터 확보, 모형 규모, 불확실성 표현 등 막히는 부분이나 피드백을 받고 싶은 점.</w:t>
+        <w:t xml:space="preserve">데이터 확보, formulation(logical conditions를 linear constraints로 쓰는 법), 모델 규모(variables·constraints 개수, solver로 제한 시간 안에 풀리는지), 불확실성 표현(해당 시) 등 막히는 부분이나 피드백을 받고 싶은 점.</w:t>
       </w:r>
     </w:p>
     <w:tbl>

</xml_diff>